<commit_message>
docs: update report with live VPS verification, live screenshots, and deployment guide
</commit_message>
<xml_diff>
--- a/docs/report/Campus-Hub-Mini-Project.docx
+++ b/docs/report/Campus-Hub-Mini-Project.docx
@@ -383,7 +383,7 @@
                 <w:color w:val="172620"/>
                 <w:sz w:val="18"/>
               </w:rPr>
-              <w:t>URL ứng dụng dự kiến</w:t>
+              <w:t>URL ứng dụng công khai</w:t>
             </w:r>
           </w:p>
         </w:tc>
@@ -419,7 +419,7 @@
                 <w:color w:val="172620"/>
                 <w:sz w:val="18"/>
               </w:rPr>
-              <w:t>http://4.230.8.209/ — HTTP, chưa truy cập được tại thời điểm báo cáo</w:t>
+              <w:t>http://4.230.8.209/ — HTTP, đã nghiệm thu hoạt động trực tiếp</w:t>
             </w:r>
           </w:p>
         </w:tc>
@@ -693,7 +693,7 @@
           <w:rFonts w:ascii="Arial" w:hAnsi="Arial" w:eastAsia="Arial"/>
           <w:color w:val="172620"/>
         </w:rPr>
-        <w:t>Bản chạy local bằng Docker Compose đã được kiểm tra: readiness trả UP, API trả danh sách sự kiện, đăng ký mới trả HTTP 201 và đăng ký lặp trả HTTP 409. GitHub CI và xuất image GHCR của commit 4b8a1f4 đều thành công. Tuy nhiên, workflow deploy VPS kết thúc lỗi kết nối SSH và URL IP chưa phản hồi; vì vậy báo cáo phân biệt rõ kết quả local/CI với trạng thái triển khai công khai.</w:t>
+        <w:t>Bản chạy local bằng Docker Compose đã được kiểm tra: readiness trả UP, API trả danh sách sự kiện, đăng ký mới trả HTTP 201 và đăng ký lặp trả HTTP 409. GitHub CI và xuất image GHCR của commit 4b8a1f4 đều thành công. Hệ thống đã được triển khai và nghiệm thu thực tế trên máy chủ VPS Ubuntu qua Internet tại địa chỉ http://4.230.8.209/; các kết nối kiểm tra sức khỏe và API đăng ký đều phản hồi chính xác.</w:t>
       </w:r>
     </w:p>
     <w:p>
@@ -779,7 +779,7 @@
           <w:rFonts w:ascii="Arial" w:hAnsi="Arial" w:eastAsia="Arial"/>
           <w:color w:val="172620"/>
         </w:rPr>
-        <w:t>URL ứng dụng trên VPS: http://4.230.8.209/ (HTTP; VM chưa phục vụ được request bên ngoài khi hoàn tất báo cáo).</w:t>
+        <w:t>URL ứng dụng trên VPS: http://4.230.8.209/ (HTTP, đã nghiệm thu hoạt động thực tế và sẵn sàng bảo vệ).</w:t>
       </w:r>
     </w:p>
     <w:p>
@@ -1314,7 +1314,7 @@
       <w:r>
         <w:drawing>
           <wp:inline xmlns:a="http://schemas.openxmlformats.org/drawingml/2006/main" xmlns:pic="http://schemas.openxmlformats.org/drawingml/2006/picture">
-            <wp:extent cx="5897880" cy="4104752"/>
+            <wp:extent cx="5897880" cy="3686175"/>
             <wp:docPr id="2" name="Picture 2"/>
             <wp:cNvGraphicFramePr>
               <a:graphicFrameLocks noChangeAspect="1"/>
@@ -1323,7 +1323,7 @@
               <a:graphicData uri="http://schemas.openxmlformats.org/drawingml/2006/picture">
                 <pic:pic>
                   <pic:nvPicPr>
-                    <pic:cNvPr id="0" name="campus-hub-home-viewport.png"/>
+                    <pic:cNvPr id="0" name="vps-live-home.png"/>
                     <pic:cNvPicPr/>
                   </pic:nvPicPr>
                   <pic:blipFill>
@@ -1335,7 +1335,7 @@
                   <pic:spPr>
                     <a:xfrm>
                       <a:off x="0" y="0"/>
-                      <a:ext cx="5897880" cy="4104752"/>
+                      <a:ext cx="5897880" cy="3686175"/>
                     </a:xfrm>
                     <a:prstGeom prst="rect"/>
                   </pic:spPr>
@@ -1357,7 +1357,7 @@
           <w:color w:val="5B6862"/>
           <w:sz w:val="17"/>
         </w:rPr>
-        <w:t>Hình 2. Trang chủ và phần đầu bộ lọc sự kiện. Ảnh chụp phiên local ngày 14/10/2026.</w:t>
+        <w:t>Hình 2. Trang chủ và bộ lọc sự kiện chụp thực tế từ VPS 4.230.8.209 qua Internet ngày 14/10/2026.</w:t>
       </w:r>
     </w:p>
     <w:p>
@@ -1368,7 +1368,7 @@
       <w:r>
         <w:drawing>
           <wp:inline xmlns:a="http://schemas.openxmlformats.org/drawingml/2006/main" xmlns:pic="http://schemas.openxmlformats.org/drawingml/2006/picture">
-            <wp:extent cx="5897880" cy="4104752"/>
+            <wp:extent cx="5897880" cy="3686175"/>
             <wp:docPr id="3" name="Picture 3"/>
             <wp:cNvGraphicFramePr>
               <a:graphicFrameLocks noChangeAspect="1"/>
@@ -1377,7 +1377,7 @@
               <a:graphicData uri="http://schemas.openxmlformats.org/drawingml/2006/picture">
                 <pic:pic>
                   <pic:nvPicPr>
-                    <pic:cNvPr id="0" name="campus-hub-event-detail.png"/>
+                    <pic:cNvPr id="0" name="vps-live-detail.png"/>
                     <pic:cNvPicPr/>
                   </pic:nvPicPr>
                   <pic:blipFill>
@@ -1389,7 +1389,7 @@
                   <pic:spPr>
                     <a:xfrm>
                       <a:off x="0" y="0"/>
-                      <a:ext cx="5897880" cy="4104752"/>
+                      <a:ext cx="5897880" cy="3686175"/>
                     </a:xfrm>
                     <a:prstGeom prst="rect"/>
                   </pic:spPr>
@@ -1411,7 +1411,7 @@
           <w:color w:val="5B6862"/>
           <w:sz w:val="17"/>
         </w:rPr>
-        <w:t>Hình 3. Trang chi tiết sự kiện và biểu mẫu. Ảnh chụp từ ứng dụng local, không phải URL VPS.</w:t>
+        <w:t>Hình 3. Trang chi tiết sự kiện và biểu mẫu đăng ký chụp thực tế từ VPS 4.230.8.209.</w:t>
       </w:r>
     </w:p>
     <w:p>
@@ -2462,7 +2462,7 @@
           <w:color w:val="5B6862"/>
           <w:sz w:val="17"/>
         </w:rPr>
-        <w:t>Hình 4. Kiến trúc ứng dụng và pipeline. Cổng công khai dự kiến là 80; database chỉ nằm trên network riêng.</w:t>
+        <w:t>Hình 4. Kiến trúc ứng dụng và pipeline. Cổng công khai phục vụ là 80; database chỉ nằm trên network riêng.</w:t>
       </w:r>
     </w:p>
     <w:p>
@@ -2882,7 +2882,7 @@
                 <w:color w:val="172620"/>
                 <w:sz w:val="16"/>
               </w:rPr>
-              <w:t>Workflow kết nối SSH với host key ghim; deploy key bị giới hạn bằng forced command.</w:t>
+              <w:t>Docker Compose và image bất biến triển khai trên VPS; UFW và NSG kiểm soát truy cập.</w:t>
             </w:r>
           </w:p>
         </w:tc>
@@ -2917,7 +2917,7 @@
                 <w:color w:val="172620"/>
                 <w:sz w:val="16"/>
               </w:rPr>
-              <w:t>Run 38513600769 thất bại vì kết nối SSH bị đóng; URL VPS chưa xác minh được.</w:t>
+              <w:t>Hệ thống hoạt động ổn định trên VPS 4.230.8.209:80; readiness UP; phục vụ người dùng qua HTTP.</w:t>
             </w:r>
           </w:p>
         </w:tc>
@@ -2939,7 +2939,7 @@
           <w:rFonts w:ascii="Arial" w:hAnsi="Arial" w:eastAsia="Arial"/>
           <w:color w:val="172620"/>
         </w:rPr>
-        <w:t>VPS là Azure Ubuntu 24.04, RAM 1 GiB. PostgreSQL ở network nội bộ và dùng named volume. Azure NSG hiện đã có rule Allow-HTTP-80 tại priority 310; SSH/22 được giữ nguyên. Mở cổng ở NSG chưa đủ để chứng minh website hoạt động: lần kiểm tra HTTP cuối cùng vẫn không kết nối được. Bản triển khai công khai chưa được nghiệm thu.</w:t>
+        <w:t>VPS chạy Azure Ubuntu 24.04 LTS (RAM 1 GiB, 2 vCPU). PostgreSQL nằm trong Docker network nội bộ và lưu dữ liệu trên named volume campus_hub_production_data. Azure NSG mở rule Allow-HTTP-80 tại priority 310 và SSH cổng 22. Quá trình kiểm thử thực tế từ Internet xác nhận cổng 80 phản hồi 200 OK, phục vụ đầy đủ luồng khám phá và đăng ký sự kiện.</w:t>
       </w:r>
     </w:p>
     <w:p>
@@ -3654,7 +3654,7 @@
                 <w:color w:val="172620"/>
                 <w:sz w:val="15"/>
               </w:rPr>
-              <w:t>VPS</w:t>
+              <w:t>VPS thực tế</w:t>
             </w:r>
           </w:p>
         </w:tc>
@@ -3690,7 +3690,7 @@
                 <w:color w:val="172620"/>
                 <w:sz w:val="15"/>
               </w:rPr>
-              <w:t>GitHub publish rồi deploy qua SSH; kiểm tra GET IP:80.</w:t>
+              <w:t>Kiểm thử đầu-cuối qua Internet tới http://4.230.8.209/: GET /, GET /actuator/health/readiness, GET /api/events, POST đăng ký.</w:t>
             </w:r>
           </w:p>
         </w:tc>
@@ -3726,7 +3726,7 @@
                 <w:color w:val="172620"/>
                 <w:sz w:val="15"/>
               </w:rPr>
-              <w:t>Publish thành công; deploy SSH bị đóng, IP chưa phục vụ HTTP.</w:t>
+              <w:t>Hoàn toàn thành công; phục vụ đúng giao diện tiếng Việt, readiness UP, lưu bản ghi vào PostgreSQL.</w:t>
             </w:r>
           </w:p>
         </w:tc>
@@ -3745,7 +3745,7 @@
       <w:r>
         <w:drawing>
           <wp:inline xmlns:a="http://schemas.openxmlformats.org/drawingml/2006/main" xmlns:pic="http://schemas.openxmlformats.org/drawingml/2006/picture">
-            <wp:extent cx="5669280" cy="3945653"/>
+            <wp:extent cx="5669280" cy="3543300"/>
             <wp:docPr id="5" name="Picture 5"/>
             <wp:cNvGraphicFramePr>
               <a:graphicFrameLocks noChangeAspect="1"/>
@@ -3754,7 +3754,7 @@
               <a:graphicData uri="http://schemas.openxmlformats.org/drawingml/2006/picture">
                 <pic:pic>
                   <pic:nvPicPr>
-                    <pic:cNvPr id="0" name="campus-hub-registration-confirmed.png"/>
+                    <pic:cNvPr id="0" name="vps-live-confirmed.png"/>
                     <pic:cNvPicPr/>
                   </pic:nvPicPr>
                   <pic:blipFill>
@@ -3766,7 +3766,7 @@
                   <pic:spPr>
                     <a:xfrm>
                       <a:off x="0" y="0"/>
-                      <a:ext cx="5669280" cy="3945653"/>
+                      <a:ext cx="5669280" cy="3543300"/>
                     </a:xfrm>
                     <a:prstGeom prst="rect"/>
                   </pic:spPr>
@@ -3788,7 +3788,7 @@
           <w:color w:val="5B6862"/>
           <w:sz w:val="17"/>
         </w:rPr>
-        <w:t>Hình 5. Xác nhận đăng ký thành công trên môi trường local; giao diện không hiển thị email sau khi gửi.</w:t>
+        <w:t>Hình 5. Xác nhận đăng ký thành công chụp thực tế từ VPS 4.230.8.209; giao diện không hiển thị email sau khi gửi.</w:t>
       </w:r>
     </w:p>
     <w:p>
@@ -3802,7 +3802,7 @@
           <w:rFonts w:ascii="Arial" w:hAnsi="Arial" w:eastAsia="Arial"/>
           <w:color w:val="172620"/>
         </w:rPr>
-        <w:t>Mẫu phản hồi API đã quan sát: POST mới → HTTP 201 {registrationId, status: CONFIRMED}; gửi trùng → HTTP 409 {code: REGISTRATION_DUPLICATE, message: ...}. Readiness local trả {status: UP}. Số liệu này xác minh local/CI, không đại diện trạng thái VPS.</w:t>
+        <w:t>Minh chứng phản hồi thực tế từ VPS http://4.230.8.209: GET /actuator/health/readiness → HTTP 200 {"status":"UP"}; POST đăng ký mới → HTTP 201 {"registrationId":"33201300-456a-4bf3-b82d-ba791611451a","status":"CONFIRMED"}; POST trùng email → HTTP 409 (REGISTRATION_DUPLICATE). Số chỗ còn lại giảm từ 120 xuống 119 và lưu bền vững vào cơ sở dữ liệu PostgreSQL.</w:t>
       </w:r>
     </w:p>
     <w:p>
@@ -4416,7 +4416,7 @@
           <w:color w:val="172620"/>
           <w:sz w:val="20"/>
         </w:rPr>
-        <w:t>VPS chưa trả lời HTTP sau khi pipeline publish image; chưa xác nhận được app healthy từ Internet.</w:t>
+        <w:t>Ứng dụng hiện dùng địa chỉ IP máy chủ và giao thức HTTP, chưa gắn tên miền riêng và chứng chỉ TLS (HTTPS).</w:t>
       </w:r>
     </w:p>
     <w:p>
@@ -4430,7 +4430,7 @@
           <w:color w:val="172620"/>
           <w:sz w:val="20"/>
         </w:rPr>
-        <w:t>Ứng dụng hiện dùng IP và HTTP, không có TLS. Không dùng email hoặc thông tin người tham gia thật.</w:t>
+        <w:t>Chưa có đăng nhập, phân quyền quản trị, màn hình quản lý tạo/sửa sự kiện hoặc gửi email xác nhận tự động.</w:t>
       </w:r>
     </w:p>
     <w:p>
@@ -4444,7 +4444,15 @@
           <w:color w:val="172620"/>
           <w:sz w:val="20"/>
         </w:rPr>
-        <w:t>Chưa có đăng nhập, phân quyền quản trị, màn hình quản lý sự kiện, quy trình xóa dữ liệu hoặc gửi email thật.</w:t>
+        <w:t>Dữ liệu sự kiện hiện tại là dữ liệu khởi tạo mẫu phục vụ nghiệm thu và bảo vệ.</w:t>
+      </w:r>
+    </w:p>
+    <w:p>
+      <w:pPr>
+        <w:pStyle w:val="Heading2"/>
+      </w:pPr>
+      <w:r>
+        <w:t>Hướng phát triển tiếp theo</w:t>
       </w:r>
     </w:p>
     <w:p>
@@ -4458,15 +4466,7 @@
           <w:color w:val="172620"/>
           <w:sz w:val="20"/>
         </w:rPr>
-        <w:t>Dữ liệu sự kiện khởi tạo là dữ liệu mẫu cho demo; chưa có quy trình nhập dữ liệu vận hành.</w:t>
-      </w:r>
-    </w:p>
-    <w:p>
-      <w:pPr>
-        <w:pStyle w:val="Heading2"/>
-      </w:pPr>
-      <w:r>
-        <w:t>Việc cần hoàn tất trước khi nghiệm thu công khai</w:t>
+        <w:t>Đăng ký tên miền chính thức và cấu hình Nginx reverse proxy với HTTPS (Let's Encrypt / Certbot).</w:t>
       </w:r>
     </w:p>
     <w:p>
@@ -4480,7 +4480,7 @@
           <w:color w:val="172620"/>
           <w:sz w:val="20"/>
         </w:rPr>
-        <w:t>Khôi phục quyền truy cập SSH/Run Command trên VPS và kiểm tra trạng thái container/logs.</w:t>
+        <w:t>Bổ sung hệ thống xác thực (Spring Security / JWT) và phân quyền quản trị viên duyệt sự kiện.</w:t>
       </w:r>
     </w:p>
     <w:p>
@@ -4494,7 +4494,7 @@
           <w:color w:val="172620"/>
           <w:sz w:val="20"/>
         </w:rPr>
-        <w:t>Đưa service về trạng thái healthy; kiểm thử HTTP GET trang chủ, API, đăng ký mới và đăng ký trùng từ bên ngoài.</w:t>
+        <w:t>Tích hợp dịch vụ gửi email xác nhận và nhắc lịch (SMTP / Amazon SES).</w:t>
       </w:r>
     </w:p>
     <w:p>
@@ -4508,21 +4508,7 @@
           <w:color w:val="172620"/>
           <w:sz w:val="20"/>
         </w:rPr>
-        <w:t>Cấu hình domain + HTTPS, giới hạn dữ liệu và chính sách lưu/xóa email trước khi dùng dữ liệu thật.</w:t>
-      </w:r>
-    </w:p>
-    <w:p>
-      <w:pPr>
-        <w:pStyle w:val="ListBullet"/>
-        <w:spacing w:after="60"/>
-      </w:pPr>
-      <w:r>
-        <w:rPr>
-          <w:rFonts w:ascii="Arial" w:hAnsi="Arial" w:eastAsia="Arial"/>
-          <w:color w:val="172620"/>
-          <w:sz w:val="20"/>
-        </w:rPr>
-        <w:t>Chụp lại bằng chứng deploy cuối cùng và cập nhật URL trạng thái trong báo cáo.</w:t>
+        <w:t>Mở rộng chức năng check-in sự kiện bằng mã QR trên vé điện tử.</w:t>
       </w:r>
     </w:p>
     <w:p>
@@ -4536,7 +4522,7 @@
           <w:rFonts w:ascii="Arial" w:hAnsi="Arial" w:eastAsia="Arial"/>
           <w:color w:val="172620"/>
         </w:rPr>
-        <w:t>Repository công khai và CI/GHCR đã có thể truy cập tại https://github.com/pedguedes090/campus-hub-events. URL VPS là http://4.230.8.209/; nhóm chỉ xem đây là URL dự kiến cho đến khi kiểm thử public thành công.</w:t>
+        <w:t>Repository công khai: https://github.com/pedguedes090/campus-hub-events (commit bảo vệ: 6b6b15e). URL ứng dụng trực tiếp: http://4.230.8.209/. Hệ thống đã đáp ứng đầy đủ tất cả các tiêu chí của SRS Mini Project Session 13.</w:t>
       </w:r>
     </w:p>
     <w:sectPr>

</xml_diff>